<commit_message>
Manual 1.1 and errata 1.0
</commit_message>
<xml_diff>
--- a/docs/Manual_SK.docx
+++ b/docs/Manual_SK.docx
@@ -149,7 +149,13 @@
         <w:rPr>
           <w:rFonts w:ascii="Bahnschrift Light Condensed" w:hAnsi="Bahnschrift Light Condensed"/>
         </w:rPr>
-        <w:t>V 1.0</w:t>
+        <w:t>V 1.</w:t>
+      </w:r>
+      <w:r>
+        <w:rPr>
+          <w:rFonts w:ascii="Bahnschrift Light Condensed" w:hAnsi="Bahnschrift Light Condensed"/>
+        </w:rPr>
+        <w:t>1</w:t>
       </w:r>
       <w:r>
         <w:rPr>
@@ -321,10 +327,7 @@
                         <w:txbxContent>
                           <w:p>
                             <w:r>
-                              <w:t>1</w:t>
-                            </w:r>
-                            <w:r>
-                              <w:t>0</w:t>
+                              <w:t>10</w:t>
                             </w:r>
                           </w:p>
                         </w:txbxContent>
@@ -2120,6 +2123,9 @@
       <w:r>
         <w:t>Tlačidlo pauza</w:t>
       </w:r>
+      <w:r>
+        <w:t xml:space="preserve"> / prepnutie TCS módu</w:t>
+      </w:r>
     </w:p>
     <w:p>
       <w:pPr>
@@ -2191,7 +2197,15 @@
         <w:t>pred</w:t>
       </w:r>
       <w:r>
-        <w:t xml:space="preserve"> spustením hry. Ak nebude ovládač pripojený ku počítaču pred spustením hry, hra ho nebude registrovať. Ak dôjde počas hry k odpojeniu ovládača, stačí ho zapojiť späť, modifikácia podporuje hot-plug zapojenie.</w:t>
+        <w:t xml:space="preserve"> spustením hry. Ak nebude ovládač pripojený ku počítaču pred spustením hry, hra ho nebude registrovať. Ak dôjde počas hry k odpojeniu ovládača, stačí ho zapojiť späť, modifikácia podporuje hot-</w:t>
+      </w:r>
+      <w:proofErr w:type="spellStart"/>
+      <w:r>
+        <w:t>plug</w:t>
+      </w:r>
+      <w:proofErr w:type="spellEnd"/>
+      <w:r>
+        <w:t xml:space="preserve"> zapojenie.</w:t>
       </w:r>
     </w:p>
     <w:p>
@@ -2486,6 +2500,9 @@
         <w:br/>
       </w:r>
       <w:r>
+        <w:rPr>
+          <w:noProof/>
+        </w:rPr>
         <w:drawing>
           <wp:inline distT="0" distB="0" distL="0" distR="0" wp14:anchorId="4EAD4D3B" wp14:editId="7CF36864">
             <wp:extent cx="5731510" cy="2186305"/>
@@ -2851,6 +2868,9 @@
         </w:numPr>
       </w:pPr>
       <w:r>
+        <w:rPr>
+          <w:noProof/>
+        </w:rPr>
         <w:drawing>
           <wp:inline distT="0" distB="0" distL="0" distR="0" wp14:anchorId="4F30BF7D" wp14:editId="1C2F0271">
             <wp:extent cx="4953691" cy="1200318"/>
@@ -2909,7 +2929,39 @@
         <w:t>Obsahuje informácie o staniciach na trati</w:t>
       </w:r>
       <w:r>
-        <w:t>, ich relatívnej vzdialenosti a časy príchodov a odchodov. Na príklade hore vidíme, že sme vyšli zo stanice Košice o viac než minútu skôr než sme mali (Departure – odchod, je 09:27:00, ale skutočný čas odchodu, actual, je 09:25:48). Na ďalšom riadku vidíme, že ďalšia je stanica Ťahanovce ktorá je 3,7 kilometra ďaleko od nás (Distance – vzdialenosť), a plánovaný príchod (Arrival) do tejto stanice je 09:31:00, odchod 09:32:00.</w:t>
+        <w:t>, ich relatívnej vzdialenosti a časy príchodov a odchodov. Na príklade hore vidíme, že sme vyšli zo stanice Košice o viac než minútu skôr než sme mali (</w:t>
+      </w:r>
+      <w:proofErr w:type="spellStart"/>
+      <w:r>
+        <w:t>Departure</w:t>
+      </w:r>
+      <w:proofErr w:type="spellEnd"/>
+      <w:r>
+        <w:t xml:space="preserve"> – odchod, je 09:27:00, ale skutočný čas odchodu, </w:t>
+      </w:r>
+      <w:proofErr w:type="spellStart"/>
+      <w:r>
+        <w:t>actual</w:t>
+      </w:r>
+      <w:proofErr w:type="spellEnd"/>
+      <w:r>
+        <w:t>, je 09:25:48). Na ďalšom riadku vidíme, že ďalšia je stanica Ťahanovce ktorá je 3,7 kilometra ďaleko od nás (</w:t>
+      </w:r>
+      <w:proofErr w:type="spellStart"/>
+      <w:r>
+        <w:t>Distance</w:t>
+      </w:r>
+      <w:proofErr w:type="spellEnd"/>
+      <w:r>
+        <w:t xml:space="preserve"> – vzdialenosť), a plánovaný príchod (</w:t>
+      </w:r>
+      <w:proofErr w:type="spellStart"/>
+      <w:r>
+        <w:t>Arrival</w:t>
+      </w:r>
+      <w:proofErr w:type="spellEnd"/>
+      <w:r>
+        <w:t>) do tejto stanice je 09:31:00, odchod 09:32:00.</w:t>
       </w:r>
     </w:p>
     <w:p>
@@ -2950,6 +3002,9 @@
         </w:numPr>
       </w:pPr>
       <w:r>
+        <w:rPr>
+          <w:noProof/>
+        </w:rPr>
         <w:drawing>
           <wp:anchor distT="0" distB="0" distL="114300" distR="114300" simplePos="0" relativeHeight="251693056" behindDoc="0" locked="0" layoutInCell="1" allowOverlap="1" wp14:anchorId="4200B54C" wp14:editId="36D87280">
             <wp:simplePos x="0" y="0"/>
@@ -3001,7 +3056,23 @@
         </w:drawing>
       </w:r>
       <w:r>
-        <w:t>Traťový monitor ukazuje základné informácie o vlaku (nie vždy presné) a trati vpred. V hornej časti je speed – aktuálna rýchlosť vlaku, projected – predpokladaná rýchlosť vlaku po zrýchlení a limit – maximálna povolená/bezpečná rýchlosť.</w:t>
+        <w:t xml:space="preserve">Traťový monitor ukazuje základné informácie o vlaku (nie vždy presné) a trati vpred. V hornej časti je </w:t>
+      </w:r>
+      <w:proofErr w:type="spellStart"/>
+      <w:r>
+        <w:t>speed</w:t>
+      </w:r>
+      <w:proofErr w:type="spellEnd"/>
+      <w:r>
+        <w:t xml:space="preserve"> – aktuálna rýchlosť vlaku, </w:t>
+      </w:r>
+      <w:proofErr w:type="spellStart"/>
+      <w:r>
+        <w:t>projected</w:t>
+      </w:r>
+      <w:proofErr w:type="spellEnd"/>
+      <w:r>
+        <w:t xml:space="preserve"> – predpokladaná rýchlosť vlaku po zrýchlení a limit – maximálna povolená/bezpečná rýchlosť.</w:t>
       </w:r>
     </w:p>
     <w:p>
@@ -3176,7 +3247,23 @@
         </w:drawing>
       </w:r>
       <w:r>
-        <w:t xml:space="preserve"> Ak je prejdený červený semafor, vlak automaticky zaradí núdzovú brzdu a dostane sa pod status SPAD – out of control. Kontrola vlaku sa tak zablokuje a odblokuje sa sama až potom, ako bude trať voľná.</w:t>
+        <w:t xml:space="preserve"> Ak je prejdený červený semafor, vlak automaticky zaradí núdzovú brzdu a dostane sa pod status SPAD – </w:t>
+      </w:r>
+      <w:proofErr w:type="spellStart"/>
+      <w:r>
+        <w:t>out</w:t>
+      </w:r>
+      <w:proofErr w:type="spellEnd"/>
+      <w:r>
+        <w:t xml:space="preserve"> of </w:t>
+      </w:r>
+      <w:proofErr w:type="spellStart"/>
+      <w:r>
+        <w:t>control</w:t>
+      </w:r>
+      <w:proofErr w:type="spellEnd"/>
+      <w:r>
+        <w:t>. Kontrola vlaku sa tak zablokuje a odblokuje sa sama až potom, ako bude trať voľná.</w:t>
       </w:r>
     </w:p>
     <w:p>
@@ -3205,7 +3292,31 @@
         </w:numPr>
       </w:pPr>
       <w:r>
-        <w:t>Ak pri spustení hry vyskočí hláška „HID Controller not enabled“, znamená to že zariadenie nie je pripojené alebo je nefunkčné.</w:t>
+        <w:t xml:space="preserve">Ak pri spustení hry vyskočí hláška „HID </w:t>
+      </w:r>
+      <w:proofErr w:type="spellStart"/>
+      <w:r>
+        <w:t>Controller</w:t>
+      </w:r>
+      <w:proofErr w:type="spellEnd"/>
+      <w:r>
+        <w:t xml:space="preserve"> </w:t>
+      </w:r>
+      <w:proofErr w:type="spellStart"/>
+      <w:r>
+        <w:t>not</w:t>
+      </w:r>
+      <w:proofErr w:type="spellEnd"/>
+      <w:r>
+        <w:t xml:space="preserve"> </w:t>
+      </w:r>
+      <w:proofErr w:type="spellStart"/>
+      <w:r>
+        <w:t>enabled</w:t>
+      </w:r>
+      <w:proofErr w:type="spellEnd"/>
+      <w:r>
+        <w:t>“, znamená to že zariadenie nie je pripojené alebo je nefunkčné.</w:t>
       </w:r>
     </w:p>
     <w:p>
@@ -3261,7 +3372,15 @@
         </w:numPr>
       </w:pPr>
       <w:r>
-        <w:t xml:space="preserve">Pomocou testovacej aplikácie dostupej na adrese: </w:t>
+        <w:t xml:space="preserve">Pomocou testovacej aplikácie </w:t>
+      </w:r>
+      <w:proofErr w:type="spellStart"/>
+      <w:r>
+        <w:t>dostupej</w:t>
+      </w:r>
+      <w:proofErr w:type="spellEnd"/>
+      <w:r>
+        <w:t xml:space="preserve"> na adrese: </w:t>
       </w:r>
     </w:p>
     <w:p>
@@ -3287,7 +3406,15 @@
         <w:ind w:left="720"/>
       </w:pPr>
       <w:r>
-        <w:t xml:space="preserve">Aplikáciu treba zapnúť, pripojiť zariadenie a stlačiť tlačidlo „connect“. </w:t>
+        <w:t>Aplikáciu treba zapnúť, pripojiť zariadenie a stlačiť tlačidlo „</w:t>
+      </w:r>
+      <w:proofErr w:type="spellStart"/>
+      <w:r>
+        <w:t>connect</w:t>
+      </w:r>
+      <w:proofErr w:type="spellEnd"/>
+      <w:r>
+        <w:t xml:space="preserve">“. </w:t>
       </w:r>
     </w:p>
     <w:p>
@@ -3353,11 +3480,317 @@
           <w:color w:val="595959" w:themeColor="text1" w:themeTint="A6"/>
         </w:rPr>
       </w:pPr>
-      <w:r>
-        <w:rPr>
-          <w:color w:val="595959" w:themeColor="text1" w:themeTint="A6"/>
-        </w:rPr>
-        <w:t>https://github.com/CrusaderSVK287/Rpi-Pico-controller-for-OpenRails</w:t>
+      <w:hyperlink r:id="rId14" w:history="1">
+        <w:r>
+          <w:rPr>
+            <w:rStyle w:val="Hyperlink"/>
+          </w:rPr>
+          <w:t>https://github.com/CrusaderSVK287/Rpi-Pico-controller-for-OpenRails</w:t>
+        </w:r>
+      </w:hyperlink>
+    </w:p>
+    <w:p>
+      <w:pPr>
+        <w:pStyle w:val="Style2"/>
+        <w:rPr>
+          <w:b w:val="0"/>
+          <w:bCs w:val="0"/>
+        </w:rPr>
+      </w:pPr>
+      <w:r>
+        <w:rPr>
+          <w:b w:val="0"/>
+          <w:bCs w:val="0"/>
+        </w:rPr>
+        <w:lastRenderedPageBreak/>
+        <w:t>ERRATA k 1.0</w:t>
+      </w:r>
+    </w:p>
+    <w:p>
+      <w:pPr>
+        <w:pStyle w:val="Style2"/>
+        <w:rPr>
+          <w:b w:val="0"/>
+          <w:bCs w:val="0"/>
+        </w:rPr>
+      </w:pPr>
+    </w:p>
+    <w:p>
+      <w:pPr>
+        <w:pStyle w:val="Style2"/>
+        <w:rPr>
+          <w:b w:val="0"/>
+          <w:bCs w:val="0"/>
+        </w:rPr>
+      </w:pPr>
+      <w:r>
+        <w:rPr>
+          <w:b w:val="0"/>
+          <w:bCs w:val="0"/>
+        </w:rPr>
+        <w:t>Prepnutie TCS módu</w:t>
+      </w:r>
+    </w:p>
+    <w:p>
+      <w:pPr>
+        <w:pStyle w:val="Style1"/>
+        <w:numPr>
+          <w:ilvl w:val="0"/>
+          <w:numId w:val="0"/>
+        </w:numPr>
+      </w:pPr>
+      <w:r>
+        <w:t>V prípade, že sa minie červené návestidlo, vlak sa automaticky prepne do TCS (</w:t>
+      </w:r>
+      <w:proofErr w:type="spellStart"/>
+      <w:r>
+        <w:t>Train</w:t>
+      </w:r>
+      <w:proofErr w:type="spellEnd"/>
+      <w:r>
+        <w:t xml:space="preserve"> </w:t>
+      </w:r>
+      <w:proofErr w:type="spellStart"/>
+      <w:r>
+        <w:t>control</w:t>
+      </w:r>
+      <w:proofErr w:type="spellEnd"/>
+      <w:r>
+        <w:t xml:space="preserve"> </w:t>
+      </w:r>
+      <w:proofErr w:type="spellStart"/>
+      <w:r>
+        <w:t>system</w:t>
+      </w:r>
+      <w:proofErr w:type="spellEnd"/>
+      <w:r>
+        <w:t xml:space="preserve">) módu SPAD – </w:t>
+      </w:r>
+      <w:proofErr w:type="spellStart"/>
+      <w:r>
+        <w:t>out</w:t>
+      </w:r>
+      <w:proofErr w:type="spellEnd"/>
+      <w:r>
+        <w:t xml:space="preserve"> of </w:t>
+      </w:r>
+      <w:proofErr w:type="spellStart"/>
+      <w:r>
+        <w:t>control</w:t>
+      </w:r>
+      <w:proofErr w:type="spellEnd"/>
+      <w:r>
+        <w:t>. Vlak tak prestane reagovať na všetky povely. V takom prípade treba postupovať takto:</w:t>
+      </w:r>
+    </w:p>
+    <w:p>
+      <w:pPr>
+        <w:pStyle w:val="Style1"/>
+        <w:numPr>
+          <w:ilvl w:val="0"/>
+          <w:numId w:val="4"/>
+        </w:numPr>
+      </w:pPr>
+      <w:r>
+        <w:t>Počkať, kým vlak úplne zastaví</w:t>
+      </w:r>
+    </w:p>
+    <w:p>
+      <w:pPr>
+        <w:pStyle w:val="Style1"/>
+        <w:numPr>
+          <w:ilvl w:val="0"/>
+          <w:numId w:val="4"/>
+        </w:numPr>
+      </w:pPr>
+      <w:r>
+        <w:t>3 sekundy držať tlačidlo pauzy. To prepne TCS mód vlaku na manuálny (aktuálny TCS mód je viditeľný na traťovom monitore).</w:t>
+      </w:r>
+    </w:p>
+    <w:p>
+      <w:pPr>
+        <w:pStyle w:val="Style1"/>
+        <w:numPr>
+          <w:ilvl w:val="0"/>
+          <w:numId w:val="4"/>
+        </w:numPr>
+      </w:pPr>
+      <w:r>
+        <w:t>Prepnúť smer jazdy dozadu</w:t>
+      </w:r>
+    </w:p>
+    <w:p>
+      <w:pPr>
+        <w:pStyle w:val="Style1"/>
+        <w:numPr>
+          <w:ilvl w:val="0"/>
+          <w:numId w:val="4"/>
+        </w:numPr>
+      </w:pPr>
+      <w:r>
+        <w:t>Cúvať za návestidlo ktoré bolo prejdené</w:t>
+      </w:r>
+    </w:p>
+    <w:p>
+      <w:pPr>
+        <w:pStyle w:val="Style1"/>
+        <w:numPr>
+          <w:ilvl w:val="0"/>
+          <w:numId w:val="4"/>
+        </w:numPr>
+      </w:pPr>
+      <w:r>
+        <w:t>Keď už sme v bezpečnej oblasti (pred návestidlom), prepnúť TCS mód späť na auto-</w:t>
+      </w:r>
+      <w:proofErr w:type="spellStart"/>
+      <w:r>
+        <w:t>signal</w:t>
+      </w:r>
+      <w:proofErr w:type="spellEnd"/>
+      <w:r>
+        <w:t>, držaním tlačidla pauzy 3 sekundy.</w:t>
+      </w:r>
+    </w:p>
+    <w:p>
+      <w:pPr>
+        <w:pStyle w:val="Style1"/>
+        <w:numPr>
+          <w:ilvl w:val="0"/>
+          <w:numId w:val="0"/>
+        </w:numPr>
+        <w:ind w:left="720"/>
+      </w:pPr>
+    </w:p>
+    <w:p>
+      <w:pPr>
+        <w:pStyle w:val="Style1"/>
+        <w:numPr>
+          <w:ilvl w:val="0"/>
+          <w:numId w:val="0"/>
+        </w:numPr>
+        <w:ind w:left="720"/>
+      </w:pPr>
+    </w:p>
+    <w:p>
+      <w:pPr>
+        <w:pStyle w:val="Style2"/>
+        <w:rPr>
+          <w:b w:val="0"/>
+          <w:bCs w:val="0"/>
+        </w:rPr>
+      </w:pPr>
+      <w:r>
+        <w:rPr>
+          <w:b w:val="0"/>
+          <w:bCs w:val="0"/>
+        </w:rPr>
+        <w:t>TCS módy</w:t>
+      </w:r>
+    </w:p>
+    <w:p>
+      <w:pPr>
+        <w:pStyle w:val="Style1"/>
+        <w:numPr>
+          <w:ilvl w:val="0"/>
+          <w:numId w:val="0"/>
+        </w:numPr>
+      </w:pPr>
+      <w:r>
+        <w:t>Sú 2 hlavné TCS módy:</w:t>
+      </w:r>
+    </w:p>
+    <w:p>
+      <w:pPr>
+        <w:pStyle w:val="Style1"/>
+        <w:numPr>
+          <w:ilvl w:val="0"/>
+          <w:numId w:val="5"/>
+        </w:numPr>
+      </w:pPr>
+      <w:r>
+        <w:t>Auto-</w:t>
+      </w:r>
+      <w:proofErr w:type="spellStart"/>
+      <w:r>
+        <w:t>signal</w:t>
+      </w:r>
+      <w:proofErr w:type="spellEnd"/>
+      <w:r>
+        <w:t>: predvolený mód, vlak sa riadi podľa návestidiel. V tomto móde sú zapnuté aj pomocné počítadlá ako vzdialenosť jednotlivých návestidiel alebo staníc od pozície vlaku</w:t>
+      </w:r>
+    </w:p>
+    <w:p>
+      <w:pPr>
+        <w:pStyle w:val="Style1"/>
+        <w:numPr>
+          <w:ilvl w:val="0"/>
+          <w:numId w:val="5"/>
+        </w:numPr>
+      </w:pPr>
+      <w:proofErr w:type="spellStart"/>
+      <w:r>
+        <w:t>Manual</w:t>
+      </w:r>
+      <w:proofErr w:type="spellEnd"/>
+      <w:r>
+        <w:t>: Ignorujeme návestidlá a stanice. Prejdením červeného návestidla sa vlak aj</w:t>
+      </w:r>
+      <w:r>
+        <w:t xml:space="preserve"> </w:t>
+      </w:r>
+      <w:r>
+        <w:t xml:space="preserve">tak zastaví a prepne do TCS módu SPAD – </w:t>
+      </w:r>
+      <w:proofErr w:type="spellStart"/>
+      <w:r>
+        <w:t>out</w:t>
+      </w:r>
+      <w:proofErr w:type="spellEnd"/>
+      <w:r>
+        <w:t xml:space="preserve"> of </w:t>
+      </w:r>
+      <w:proofErr w:type="spellStart"/>
+      <w:r>
+        <w:t>control</w:t>
+      </w:r>
+      <w:proofErr w:type="spellEnd"/>
+    </w:p>
+    <w:p>
+      <w:pPr>
+        <w:pStyle w:val="Style1"/>
+        <w:numPr>
+          <w:ilvl w:val="0"/>
+          <w:numId w:val="0"/>
+        </w:numPr>
+        <w:ind w:left="720" w:hanging="360"/>
+      </w:pPr>
+    </w:p>
+    <w:p>
+      <w:pPr>
+        <w:pStyle w:val="Style1"/>
+        <w:numPr>
+          <w:ilvl w:val="0"/>
+          <w:numId w:val="0"/>
+        </w:numPr>
+      </w:pPr>
+      <w:r>
+        <w:t xml:space="preserve">SPAD – </w:t>
+      </w:r>
+      <w:proofErr w:type="spellStart"/>
+      <w:r>
+        <w:t>out</w:t>
+      </w:r>
+      <w:proofErr w:type="spellEnd"/>
+      <w:r>
+        <w:t xml:space="preserve"> of </w:t>
+      </w:r>
+      <w:proofErr w:type="spellStart"/>
+      <w:r>
+        <w:t>control</w:t>
+      </w:r>
+      <w:proofErr w:type="spellEnd"/>
+      <w:r>
+        <w:t xml:space="preserve"> je špeciálny typ TCS módu do ktorého sa dostaneme tak, že prejdeme červeným návestidlom. V tomto móde je vlak efektívne vypnutý a nebude reagovať na žiadne vstupy, až kým ho neprepneme do manuálneho módu.</w:t>
       </w:r>
     </w:p>
     <w:sectPr>
@@ -3690,6 +4123,205 @@
       </w:pPr>
     </w:lvl>
   </w:abstractNum>
+  <w:abstractNum w:abstractNumId="3" w15:restartNumberingAfterBreak="0">
+    <w:nsid w:val="54C84824"/>
+    <w:multiLevelType w:val="hybridMultilevel"/>
+    <w:tmpl w:val="BD92062C"/>
+    <w:lvl w:ilvl="0" w:tplc="041B0001">
+      <w:start w:val="1"/>
+      <w:numFmt w:val="bullet"/>
+      <w:lvlText w:val=""/>
+      <w:lvlJc w:val="left"/>
+      <w:pPr>
+        <w:ind w:left="720" w:hanging="360"/>
+      </w:pPr>
+      <w:rPr>
+        <w:rFonts w:ascii="Symbol" w:hAnsi="Symbol" w:hint="default"/>
+      </w:rPr>
+    </w:lvl>
+    <w:lvl w:ilvl="1" w:tplc="041B0003" w:tentative="1">
+      <w:start w:val="1"/>
+      <w:numFmt w:val="bullet"/>
+      <w:lvlText w:val="o"/>
+      <w:lvlJc w:val="left"/>
+      <w:pPr>
+        <w:ind w:left="1440" w:hanging="360"/>
+      </w:pPr>
+      <w:rPr>
+        <w:rFonts w:ascii="Courier New" w:hAnsi="Courier New" w:cs="Courier New" w:hint="default"/>
+      </w:rPr>
+    </w:lvl>
+    <w:lvl w:ilvl="2" w:tplc="041B0005" w:tentative="1">
+      <w:start w:val="1"/>
+      <w:numFmt w:val="bullet"/>
+      <w:lvlText w:val=""/>
+      <w:lvlJc w:val="left"/>
+      <w:pPr>
+        <w:ind w:left="2160" w:hanging="360"/>
+      </w:pPr>
+      <w:rPr>
+        <w:rFonts w:ascii="Wingdings" w:hAnsi="Wingdings" w:hint="default"/>
+      </w:rPr>
+    </w:lvl>
+    <w:lvl w:ilvl="3" w:tplc="041B0001" w:tentative="1">
+      <w:start w:val="1"/>
+      <w:numFmt w:val="bullet"/>
+      <w:lvlText w:val=""/>
+      <w:lvlJc w:val="left"/>
+      <w:pPr>
+        <w:ind w:left="2880" w:hanging="360"/>
+      </w:pPr>
+      <w:rPr>
+        <w:rFonts w:ascii="Symbol" w:hAnsi="Symbol" w:hint="default"/>
+      </w:rPr>
+    </w:lvl>
+    <w:lvl w:ilvl="4" w:tplc="041B0003" w:tentative="1">
+      <w:start w:val="1"/>
+      <w:numFmt w:val="bullet"/>
+      <w:lvlText w:val="o"/>
+      <w:lvlJc w:val="left"/>
+      <w:pPr>
+        <w:ind w:left="3600" w:hanging="360"/>
+      </w:pPr>
+      <w:rPr>
+        <w:rFonts w:ascii="Courier New" w:hAnsi="Courier New" w:cs="Courier New" w:hint="default"/>
+      </w:rPr>
+    </w:lvl>
+    <w:lvl w:ilvl="5" w:tplc="041B0005" w:tentative="1">
+      <w:start w:val="1"/>
+      <w:numFmt w:val="bullet"/>
+      <w:lvlText w:val=""/>
+      <w:lvlJc w:val="left"/>
+      <w:pPr>
+        <w:ind w:left="4320" w:hanging="360"/>
+      </w:pPr>
+      <w:rPr>
+        <w:rFonts w:ascii="Wingdings" w:hAnsi="Wingdings" w:hint="default"/>
+      </w:rPr>
+    </w:lvl>
+    <w:lvl w:ilvl="6" w:tplc="041B0001" w:tentative="1">
+      <w:start w:val="1"/>
+      <w:numFmt w:val="bullet"/>
+      <w:lvlText w:val=""/>
+      <w:lvlJc w:val="left"/>
+      <w:pPr>
+        <w:ind w:left="5040" w:hanging="360"/>
+      </w:pPr>
+      <w:rPr>
+        <w:rFonts w:ascii="Symbol" w:hAnsi="Symbol" w:hint="default"/>
+      </w:rPr>
+    </w:lvl>
+    <w:lvl w:ilvl="7" w:tplc="041B0003" w:tentative="1">
+      <w:start w:val="1"/>
+      <w:numFmt w:val="bullet"/>
+      <w:lvlText w:val="o"/>
+      <w:lvlJc w:val="left"/>
+      <w:pPr>
+        <w:ind w:left="5760" w:hanging="360"/>
+      </w:pPr>
+      <w:rPr>
+        <w:rFonts w:ascii="Courier New" w:hAnsi="Courier New" w:cs="Courier New" w:hint="default"/>
+      </w:rPr>
+    </w:lvl>
+    <w:lvl w:ilvl="8" w:tplc="041B0005" w:tentative="1">
+      <w:start w:val="1"/>
+      <w:numFmt w:val="bullet"/>
+      <w:lvlText w:val=""/>
+      <w:lvlJc w:val="left"/>
+      <w:pPr>
+        <w:ind w:left="6480" w:hanging="360"/>
+      </w:pPr>
+      <w:rPr>
+        <w:rFonts w:ascii="Wingdings" w:hAnsi="Wingdings" w:hint="default"/>
+      </w:rPr>
+    </w:lvl>
+  </w:abstractNum>
+  <w:abstractNum w:abstractNumId="4" w15:restartNumberingAfterBreak="0">
+    <w:nsid w:val="565E160F"/>
+    <w:multiLevelType w:val="hybridMultilevel"/>
+    <w:tmpl w:val="FF7CE2D0"/>
+    <w:lvl w:ilvl="0" w:tplc="041B000F">
+      <w:start w:val="1"/>
+      <w:numFmt w:val="decimal"/>
+      <w:lvlText w:val="%1."/>
+      <w:lvlJc w:val="left"/>
+      <w:pPr>
+        <w:ind w:left="720" w:hanging="360"/>
+      </w:pPr>
+    </w:lvl>
+    <w:lvl w:ilvl="1" w:tplc="041B0019" w:tentative="1">
+      <w:start w:val="1"/>
+      <w:numFmt w:val="lowerLetter"/>
+      <w:lvlText w:val="%2."/>
+      <w:lvlJc w:val="left"/>
+      <w:pPr>
+        <w:ind w:left="1440" w:hanging="360"/>
+      </w:pPr>
+    </w:lvl>
+    <w:lvl w:ilvl="2" w:tplc="041B001B" w:tentative="1">
+      <w:start w:val="1"/>
+      <w:numFmt w:val="lowerRoman"/>
+      <w:lvlText w:val="%3."/>
+      <w:lvlJc w:val="right"/>
+      <w:pPr>
+        <w:ind w:left="2160" w:hanging="180"/>
+      </w:pPr>
+    </w:lvl>
+    <w:lvl w:ilvl="3" w:tplc="041B000F" w:tentative="1">
+      <w:start w:val="1"/>
+      <w:numFmt w:val="decimal"/>
+      <w:lvlText w:val="%4."/>
+      <w:lvlJc w:val="left"/>
+      <w:pPr>
+        <w:ind w:left="2880" w:hanging="360"/>
+      </w:pPr>
+    </w:lvl>
+    <w:lvl w:ilvl="4" w:tplc="041B0019" w:tentative="1">
+      <w:start w:val="1"/>
+      <w:numFmt w:val="lowerLetter"/>
+      <w:lvlText w:val="%5."/>
+      <w:lvlJc w:val="left"/>
+      <w:pPr>
+        <w:ind w:left="3600" w:hanging="360"/>
+      </w:pPr>
+    </w:lvl>
+    <w:lvl w:ilvl="5" w:tplc="041B001B" w:tentative="1">
+      <w:start w:val="1"/>
+      <w:numFmt w:val="lowerRoman"/>
+      <w:lvlText w:val="%6."/>
+      <w:lvlJc w:val="right"/>
+      <w:pPr>
+        <w:ind w:left="4320" w:hanging="180"/>
+      </w:pPr>
+    </w:lvl>
+    <w:lvl w:ilvl="6" w:tplc="041B000F" w:tentative="1">
+      <w:start w:val="1"/>
+      <w:numFmt w:val="decimal"/>
+      <w:lvlText w:val="%7."/>
+      <w:lvlJc w:val="left"/>
+      <w:pPr>
+        <w:ind w:left="5040" w:hanging="360"/>
+      </w:pPr>
+    </w:lvl>
+    <w:lvl w:ilvl="7" w:tplc="041B0019" w:tentative="1">
+      <w:start w:val="1"/>
+      <w:numFmt w:val="lowerLetter"/>
+      <w:lvlText w:val="%8."/>
+      <w:lvlJc w:val="left"/>
+      <w:pPr>
+        <w:ind w:left="5760" w:hanging="360"/>
+      </w:pPr>
+    </w:lvl>
+    <w:lvl w:ilvl="8" w:tplc="041B001B" w:tentative="1">
+      <w:start w:val="1"/>
+      <w:numFmt w:val="lowerRoman"/>
+      <w:lvlText w:val="%9."/>
+      <w:lvlJc w:val="right"/>
+      <w:pPr>
+        <w:ind w:left="6480" w:hanging="180"/>
+      </w:pPr>
+    </w:lvl>
+  </w:abstractNum>
   <w:num w:numId="1" w16cid:durableId="1235355668">
     <w:abstractNumId w:val="0"/>
   </w:num>
@@ -3698,6 +4330,12 @@
   </w:num>
   <w:num w:numId="3" w16cid:durableId="1380475274">
     <w:abstractNumId w:val="1"/>
+  </w:num>
+  <w:num w:numId="4" w16cid:durableId="1640308926">
+    <w:abstractNumId w:val="3"/>
+  </w:num>
+  <w:num w:numId="5" w16cid:durableId="330644342">
+    <w:abstractNumId w:val="4"/>
   </w:num>
 </w:numbering>
 </file>

</xml_diff>